<commit_message>
Smlouva FVE: radkovani a mezery mezi odstavci o 15 % mensi
Co-Authored-By: Claude Opus 5.5 <noreply@anthropic.com>
</commit_message>
<xml_diff>
--- a/public/templates/smlouva_fve_sablona.docx
+++ b/public/templates/smlouva_fve_sablona.docx
@@ -4,7 +4,7 @@
   <w:body>
     <w:p>
       <w:pPr>
-        <w:spacing w:after="0" w:line="240" w:lineRule="auto"/>
+        <w:spacing w:after="0" w:line="204" w:lineRule="auto"/>
         <w:contextualSpacing/>
         <w:jc w:val="center"/>
         <w:rPr>
@@ -36,7 +36,7 @@
           <w:ilvl w:val="1"/>
           <w:numId w:val="0"/>
         </w:numPr>
-        <w:spacing w:after="240" w:line="240" w:lineRule="atLeast"/>
+        <w:spacing w:after="204" w:line="204" w:lineRule="auto"/>
         <w:jc w:val="center"/>
         <w:rPr>
           <w:rFonts w:ascii="Tahoma" w:eastAsia="Times New Roman" w:hAnsi="Tahoma" w:cs="Tahoma"/>
@@ -87,7 +87,7 @@
           </w:tcPr>
           <w:p>
             <w:pPr>
-              <w:spacing w:line="240" w:lineRule="atLeast"/>
+              <w:spacing w:line="204" w:lineRule="auto"/>
               <w:rPr>
                 <w:rFonts w:ascii="Tahoma" w:eastAsia="Tahoma" w:hAnsi="Tahoma" w:cs="Tahoma"/>
                 <w:sz w:val="20"/>
@@ -128,7 +128,7 @@
           </w:tcPr>
           <w:p>
             <w:pPr>
-              <w:spacing w:line="240" w:lineRule="atLeast"/>
+              <w:spacing w:line="204" w:lineRule="auto"/>
               <w:rPr>
                 <w:rFonts w:ascii="Tahoma" w:eastAsia="Tahoma" w:hAnsi="Tahoma" w:cs="Tahoma"/>
                 <w:sz w:val="20"/>
@@ -272,7 +272,7 @@
           </w:p>
           <w:p>
             <w:pPr>
-              <w:spacing w:line="240" w:lineRule="atLeast"/>
+              <w:spacing w:line="204" w:lineRule="auto"/>
               <w:rPr>
                 <w:rFonts w:ascii="Tahoma" w:eastAsia="Tahoma" w:hAnsi="Tahoma" w:cs="Tahoma"/>
                 <w:color w:val="193A67"/>
@@ -344,7 +344,7 @@
           </w:p>
           <w:p>
             <w:pPr>
-              <w:spacing w:line="240" w:lineRule="atLeast"/>
+              <w:spacing w:line="204" w:lineRule="auto"/>
               <w:rPr>
                 <w:rFonts w:ascii="Tahoma" w:eastAsia="Tahoma" w:hAnsi="Tahoma" w:cs="Tahoma"/>
                 <w:sz w:val="20"/>
@@ -367,7 +367,7 @@
           </w:p>
           <w:p>
             <w:pPr>
-              <w:spacing w:line="240" w:lineRule="atLeast"/>
+              <w:spacing w:line="204" w:lineRule="auto"/>
               <w:rPr>
                 <w:rFonts w:ascii="Tahoma" w:eastAsia="Tahoma" w:hAnsi="Tahoma" w:cs="Tahoma"/>
                 <w:sz w:val="20"/>
@@ -442,7 +442,7 @@
           </w:tcPr>
           <w:p>
             <w:pPr>
-              <w:spacing w:line="240" w:lineRule="atLeast"/>
+              <w:spacing w:line="204" w:lineRule="auto"/>
               <w:rPr>
                 <w:rFonts w:ascii="Tahoma" w:eastAsia="Tahoma" w:hAnsi="Tahoma" w:cs="Tahoma"/>
                 <w:sz w:val="20"/>
@@ -533,7 +533,7 @@
           </w:p>
           <w:p>
             <w:pPr>
-              <w:spacing w:line="240" w:lineRule="atLeast"/>
+              <w:spacing w:line="204" w:lineRule="auto"/>
               <w:rPr>
                 <w:rFonts w:ascii="Tahoma" w:eastAsia="Tahoma" w:hAnsi="Tahoma" w:cs="Tahoma"/>
                 <w:sz w:val="20"/>
@@ -578,7 +578,7 @@
           </w:p>
           <w:p>
             <w:pPr>
-              <w:spacing w:line="240" w:lineRule="atLeast"/>
+              <w:spacing w:line="204" w:lineRule="auto"/>
               <w:rPr>
                 <w:rFonts w:ascii="Tahoma" w:eastAsia="Tahoma" w:hAnsi="Tahoma" w:cs="Tahoma"/>
                 <w:sz w:val="20"/>
@@ -601,7 +601,7 @@
           </w:p>
           <w:p>
             <w:pPr>
-              <w:spacing w:line="240" w:lineRule="atLeast"/>
+              <w:spacing w:line="204" w:lineRule="auto"/>
               <w:rPr>
                 <w:rFonts w:ascii="Tahoma" w:eastAsia="Tahoma" w:hAnsi="Tahoma" w:cs="Tahoma"/>
                 <w:sz w:val="20"/>
@@ -639,7 +639,7 @@
     <w:permEnd w:id="1793599396"/>
     <w:p>
       <w:pPr>
-        <w:spacing w:after="120" w:line="240" w:lineRule="atLeast"/>
+        <w:spacing w:after="102" w:line="204" w:lineRule="auto"/>
         <w:rPr>
           <w:rFonts w:ascii="Tahoma" w:eastAsia="Tahoma" w:hAnsi="Tahoma" w:cs="Tahoma"/>
           <w:b/>
@@ -682,7 +682,7 @@
     </w:p>
     <w:p>
       <w:pPr>
-        <w:spacing w:after="0" w:line="240" w:lineRule="atLeast"/>
+        <w:spacing w:after="0" w:line="204" w:lineRule="auto"/>
         <w:rPr>
           <w:rFonts w:ascii="Tahoma" w:hAnsi="Tahoma" w:cs="Tahoma"/>
         </w:rPr>
@@ -698,7 +698,7 @@
     </w:p>
     <w:p>
       <w:pPr>
-        <w:spacing w:after="0" w:line="240" w:lineRule="atLeast"/>
+        <w:spacing w:after="0" w:line="204" w:lineRule="auto"/>
         <w:rPr>
           <w:rFonts w:ascii="Tahoma" w:eastAsia="Tahoma" w:hAnsi="Tahoma" w:cs="Tahoma"/>
           <w:sz w:val="20"/>
@@ -737,7 +737,7 @@
           <w:permEnd w:id="69805027"/>
           <w:p>
             <w:pPr>
-              <w:spacing w:line="240" w:lineRule="atLeast"/>
+              <w:spacing w:line="204" w:lineRule="auto"/>
               <w:rPr>
                 <w:rFonts w:ascii="Tahoma" w:eastAsia="Tahoma" w:hAnsi="Tahoma" w:cs="Tahoma"/>
                 <w:sz w:val="20"/>
@@ -761,7 +761,7 @@
           </w:tcPr>
           <w:p>
             <w:pPr>
-              <w:spacing w:line="240" w:lineRule="atLeast"/>
+              <w:spacing w:line="204" w:lineRule="auto"/>
               <w:rPr>
                 <w:rFonts w:ascii="Tahoma" w:eastAsia="Tahoma" w:hAnsi="Tahoma" w:cs="Tahoma"/>
                 <w:sz w:val="20"/>
@@ -798,7 +798,7 @@
           </w:p>
           <w:p>
             <w:pPr>
-              <w:spacing w:line="240" w:lineRule="atLeast"/>
+              <w:spacing w:line="204" w:lineRule="auto"/>
               <w:rPr>
                 <w:rFonts w:ascii="Tahoma" w:eastAsia="Tahoma" w:hAnsi="Tahoma" w:cs="Tahoma"/>
                 <w:sz w:val="20"/>
@@ -814,7 +814,7 @@
           </w:p>
           <w:p>
             <w:pPr>
-              <w:spacing w:line="240" w:lineRule="atLeast"/>
+              <w:spacing w:line="204" w:lineRule="auto"/>
               <w:rPr>
                 <w:rFonts w:ascii="Tahoma" w:eastAsia="Tahoma" w:hAnsi="Tahoma" w:cs="Tahoma"/>
                 <w:sz w:val="20"/>
@@ -858,7 +858,7 @@
           </w:p>
           <w:p>
             <w:pPr>
-              <w:spacing w:line="240" w:lineRule="atLeast"/>
+              <w:spacing w:line="204" w:lineRule="auto"/>
               <w:rPr>
                 <w:rFonts w:ascii="Tahoma" w:eastAsia="Tahoma" w:hAnsi="Tahoma" w:cs="Tahoma"/>
                 <w:sz w:val="20"/>
@@ -923,7 +923,7 @@
           </w:p>
           <w:p>
             <w:pPr>
-              <w:spacing w:line="240" w:lineRule="atLeast"/>
+              <w:spacing w:line="204" w:lineRule="auto"/>
               <w:rPr>
                 <w:rFonts w:ascii="Tahoma" w:eastAsia="Tahoma" w:hAnsi="Tahoma" w:cs="Tahoma"/>
                 <w:sz w:val="20"/>
@@ -939,7 +939,7 @@
           </w:p>
           <w:p>
             <w:pPr>
-              <w:spacing w:line="240" w:lineRule="atLeast"/>
+              <w:spacing w:line="204" w:lineRule="auto"/>
               <w:rPr>
                 <w:rFonts w:ascii="Tahoma" w:eastAsia="Tahoma" w:hAnsi="Tahoma" w:cs="Tahoma"/>
                 <w:sz w:val="20"/>
@@ -977,7 +977,7 @@
           </w:tcPr>
           <w:p>
             <w:pPr>
-              <w:spacing w:line="240" w:lineRule="atLeast"/>
+              <w:spacing w:line="204" w:lineRule="auto"/>
               <w:rPr>
                 <w:rFonts w:ascii="Tahoma" w:eastAsia="Tahoma" w:hAnsi="Tahoma" w:cs="Tahoma"/>
                 <w:b/>
@@ -1017,7 +1017,7 @@
             <w:sdtContent>
               <w:p>
                 <w:pPr>
-                  <w:spacing w:line="240" w:lineRule="atLeast"/>
+                  <w:spacing w:line="204" w:lineRule="auto"/>
                   <w:rPr>
                     <w:rFonts w:ascii="Tahoma" w:eastAsia="Tahoma" w:hAnsi="Tahoma" w:cs="Tahoma"/>
                     <w:sz w:val="20"/>
@@ -1043,7 +1043,7 @@
           </w:tcPr>
           <w:p>
             <w:pPr>
-              <w:spacing w:line="240" w:lineRule="atLeast"/>
+              <w:spacing w:line="204" w:lineRule="auto"/>
               <w:rPr>
                 <w:rFonts w:ascii="Tahoma" w:eastAsia="Tahoma" w:hAnsi="Tahoma" w:cs="Tahoma"/>
                 <w:b/>
@@ -1078,7 +1078,7 @@
           </w:tcPr>
           <w:p>
             <w:pPr>
-              <w:spacing w:line="240" w:lineRule="atLeast"/>
+              <w:spacing w:line="204" w:lineRule="auto"/>
               <w:rPr>
                 <w:rFonts w:ascii="Tahoma" w:eastAsia="Tahoma" w:hAnsi="Tahoma" w:cs="Tahoma"/>
                 <w:sz w:val="20"/>
@@ -1101,7 +1101,7 @@
           </w:p>
           <w:p>
             <w:pPr>
-              <w:spacing w:line="240" w:lineRule="atLeast"/>
+              <w:spacing w:line="204" w:lineRule="auto"/>
               <w:rPr>
                 <w:rFonts w:ascii="Tahoma" w:eastAsia="Tahoma" w:hAnsi="Tahoma" w:cs="Tahoma"/>
                 <w:sz w:val="20"/>
@@ -1117,7 +1117,7 @@
           </w:p>
           <w:p>
             <w:pPr>
-              <w:spacing w:line="240" w:lineRule="atLeast"/>
+              <w:spacing w:line="204" w:lineRule="auto"/>
               <w:rPr>
                 <w:rFonts w:ascii="Tahoma" w:eastAsia="Tahoma" w:hAnsi="Tahoma" w:cs="Tahoma"/>
                 <w:sz w:val="20"/>
@@ -1148,7 +1148,7 @@
           </w:p>
           <w:p>
             <w:pPr>
-              <w:spacing w:line="240" w:lineRule="atLeast"/>
+              <w:spacing w:line="204" w:lineRule="auto"/>
               <w:rPr>
                 <w:rFonts w:ascii="Tahoma" w:eastAsia="Tahoma" w:hAnsi="Tahoma" w:cs="Tahoma"/>
                 <w:sz w:val="20"/>
@@ -1164,7 +1164,7 @@
           </w:p>
           <w:p>
             <w:pPr>
-              <w:spacing w:line="240" w:lineRule="atLeast"/>
+              <w:spacing w:line="204" w:lineRule="auto"/>
               <w:rPr>
                 <w:rFonts w:ascii="Tahoma" w:eastAsia="Tahoma" w:hAnsi="Tahoma" w:cs="Tahoma"/>
                 <w:sz w:val="20"/>
@@ -1181,7 +1181,7 @@
           </w:tcPr>
           <w:p>
             <w:pPr>
-              <w:spacing w:line="240" w:lineRule="atLeast"/>
+              <w:spacing w:line="204" w:lineRule="auto"/>
               <w:rPr>
                 <w:rFonts w:ascii="Tahoma" w:eastAsia="Tahoma" w:hAnsi="Tahoma" w:cs="Tahoma"/>
                 <w:b/>
@@ -1206,7 +1206,7 @@
           </w:tcPr>
           <w:p>
             <w:pPr>
-              <w:spacing w:line="240" w:lineRule="atLeast"/>
+              <w:spacing w:line="204" w:lineRule="auto"/>
               <w:rPr>
                 <w:rFonts w:ascii="Tahoma" w:eastAsia="Tahoma" w:hAnsi="Tahoma" w:cs="Tahoma"/>
                 <w:sz w:val="20"/>
@@ -1245,7 +1245,7 @@
           </w:tcPr>
           <w:p>
             <w:pPr>
-              <w:spacing w:line="240" w:lineRule="atLeast"/>
+              <w:spacing w:line="204" w:lineRule="auto"/>
               <w:rPr>
                 <w:rFonts w:ascii="Tahoma" w:eastAsia="Tahoma" w:hAnsi="Tahoma" w:cs="Tahoma"/>
                 <w:b/>
@@ -1271,7 +1271,7 @@
           </w:tcPr>
           <w:p>
             <w:pPr>
-              <w:spacing w:line="240" w:lineRule="atLeast"/>
+              <w:spacing w:line="204" w:lineRule="auto"/>
               <w:rPr>
                 <w:rFonts w:ascii="Tahoma" w:eastAsia="Tahoma" w:hAnsi="Tahoma" w:cs="Tahoma"/>
                 <w:sz w:val="20"/>
@@ -1380,7 +1380,7 @@
           </w:p>
           <w:p>
             <w:pPr>
-              <w:spacing w:line="240" w:lineRule="atLeast"/>
+              <w:spacing w:line="204" w:lineRule="auto"/>
               <w:rPr>
                 <w:rFonts w:ascii="Tahoma" w:eastAsia="Tahoma" w:hAnsi="Tahoma" w:cs="Tahoma"/>
                 <w:sz w:val="20"/>
@@ -1389,7 +1389,7 @@
           </w:p>
           <w:p>
             <w:pPr>
-              <w:spacing w:line="240" w:lineRule="atLeast"/>
+              <w:spacing w:line="204" w:lineRule="auto"/>
               <w:rPr>
                 <w:rFonts w:ascii="Tahoma" w:eastAsia="Tahoma" w:hAnsi="Tahoma" w:cs="Tahoma"/>
                 <w:sz w:val="20"/>
@@ -1398,7 +1398,7 @@
           </w:p>
           <w:p>
             <w:pPr>
-              <w:spacing w:line="240" w:lineRule="atLeast"/>
+              <w:spacing w:line="204" w:lineRule="auto"/>
               <w:rPr>
                 <w:rFonts w:ascii="Tahoma" w:eastAsia="Tahoma" w:hAnsi="Tahoma" w:cs="Tahoma"/>
                 <w:sz w:val="20"/>
@@ -1432,7 +1432,7 @@
                 <w:ilvl w:val="0"/>
                 <w:numId w:val="4"/>
               </w:numPr>
-              <w:spacing w:line="240" w:lineRule="atLeast"/>
+              <w:spacing w:line="204" w:lineRule="auto"/>
               <w:rPr>
                 <w:rFonts w:ascii="Tahoma" w:eastAsia="Tahoma" w:hAnsi="Tahoma" w:cs="Tahoma"/>
                 <w:sz w:val="20"/>
@@ -1475,7 +1475,7 @@
                 <w:ilvl w:val="0"/>
                 <w:numId w:val="4"/>
               </w:numPr>
-              <w:spacing w:line="240" w:lineRule="atLeast"/>
+              <w:spacing w:line="204" w:lineRule="auto"/>
               <w:rPr>
                 <w:rFonts w:ascii="Tahoma" w:eastAsia="Tahoma" w:hAnsi="Tahoma" w:cs="Tahoma"/>
                 <w:sz w:val="20"/>
@@ -1495,7 +1495,7 @@
                 <w:ilvl w:val="0"/>
                 <w:numId w:val="4"/>
               </w:numPr>
-              <w:spacing w:line="240" w:lineRule="atLeast"/>
+              <w:spacing w:line="204" w:lineRule="auto"/>
               <w:rPr>
                 <w:rFonts w:ascii="Tahoma" w:eastAsia="Tahoma" w:hAnsi="Tahoma" w:cs="Tahoma"/>
                 <w:sz w:val="20"/>
@@ -1518,7 +1518,7 @@
           </w:p>
           <w:p>
             <w:pPr>
-              <w:spacing w:line="240" w:lineRule="atLeast"/>
+              <w:spacing w:line="204" w:lineRule="auto"/>
               <w:ind w:left="720"/>
               <w:rPr>
                 <w:rFonts w:ascii="Tahoma" w:eastAsia="Tahoma" w:hAnsi="Tahoma" w:cs="Tahoma"/>
@@ -1528,7 +1528,7 @@
           </w:p>
           <w:p>
             <w:pPr>
-              <w:spacing w:line="240" w:lineRule="atLeast"/>
+              <w:spacing w:line="204" w:lineRule="auto"/>
               <w:rPr>
                 <w:rFonts w:ascii="Tahoma" w:eastAsia="Tahoma" w:hAnsi="Tahoma" w:cs="Tahoma"/>
                 <w:sz w:val="20"/>
@@ -1548,7 +1548,7 @@
                 <w:ilvl w:val="0"/>
                 <w:numId w:val="4"/>
               </w:numPr>
-              <w:spacing w:line="240" w:lineRule="atLeast"/>
+              <w:spacing w:line="204" w:lineRule="auto"/>
               <w:rPr>
                 <w:rFonts w:ascii="Tahoma" w:eastAsia="Tahoma" w:hAnsi="Tahoma" w:cs="Tahoma"/>
                 <w:sz w:val="20"/>
@@ -1587,7 +1587,7 @@
           <w:ilvl w:val="0"/>
           <w:numId w:val="2"/>
         </w:numPr>
-        <w:spacing w:before="360" w:after="120" w:line="240" w:lineRule="atLeast"/>
+        <w:spacing w:before="306" w:after="102" w:line="204" w:lineRule="auto"/>
         <w:jc w:val="center"/>
         <w:rPr>
           <w:rFonts w:ascii="Tahoma" w:eastAsia="Tahoma" w:hAnsi="Tahoma" w:cs="Tahoma"/>
@@ -1848,7 +1848,7 @@
           <w:ilvl w:val="1"/>
           <w:numId w:val="2"/>
         </w:numPr>
-        <w:spacing w:after="120" w:line="240" w:lineRule="atLeast"/>
+        <w:spacing w:after="102" w:line="204" w:lineRule="auto"/>
         <w:rPr>
           <w:rFonts w:ascii="Tahoma" w:eastAsia="Tahoma" w:hAnsi="Tahoma" w:cs="Tahoma"/>
           <w:sz w:val="20"/>
@@ -2893,7 +2893,7 @@
           <w:ilvl w:val="0"/>
           <w:numId w:val="2"/>
         </w:numPr>
-        <w:spacing w:before="360" w:after="120" w:line="240" w:lineRule="atLeast"/>
+        <w:spacing w:before="306" w:after="102" w:line="204" w:lineRule="auto"/>
         <w:jc w:val="center"/>
         <w:rPr>
           <w:rFonts w:ascii="Tahoma" w:eastAsia="Tahoma" w:hAnsi="Tahoma" w:cs="Tahoma"/>
@@ -3571,7 +3571,7 @@
           <w:ilvl w:val="0"/>
           <w:numId w:val="2"/>
         </w:numPr>
-        <w:spacing w:before="360" w:after="120" w:line="240" w:lineRule="atLeast"/>
+        <w:spacing w:before="306" w:after="102" w:line="204" w:lineRule="auto"/>
         <w:jc w:val="center"/>
         <w:rPr>
           <w:rFonts w:ascii="Tahoma" w:eastAsia="Tahoma" w:hAnsi="Tahoma" w:cs="Tahoma"/>
@@ -3831,7 +3831,7 @@
           <w:ilvl w:val="0"/>
           <w:numId w:val="2"/>
         </w:numPr>
-        <w:spacing w:before="360" w:after="120" w:line="240" w:lineRule="atLeast"/>
+        <w:spacing w:before="306" w:after="102" w:line="204" w:lineRule="auto"/>
         <w:jc w:val="center"/>
         <w:rPr>
           <w:rFonts w:ascii="Tahoma" w:eastAsia="Tahoma" w:hAnsi="Tahoma" w:cs="Tahoma"/>
@@ -3887,7 +3887,7 @@
           <w:ilvl w:val="0"/>
           <w:numId w:val="2"/>
         </w:numPr>
-        <w:spacing w:before="360" w:after="120" w:line="240" w:lineRule="atLeast"/>
+        <w:spacing w:before="306" w:after="102" w:line="204" w:lineRule="auto"/>
         <w:jc w:val="center"/>
         <w:rPr>
           <w:rFonts w:ascii="Tahoma" w:eastAsia="Tahoma" w:hAnsi="Tahoma" w:cs="Tahoma"/>
@@ -4898,7 +4898,7 @@
           <w:ilvl w:val="0"/>
           <w:numId w:val="2"/>
         </w:numPr>
-        <w:spacing w:before="360" w:after="120" w:line="240" w:lineRule="atLeast"/>
+        <w:spacing w:before="306" w:after="102" w:line="204" w:lineRule="auto"/>
         <w:jc w:val="center"/>
         <w:rPr>
           <w:rFonts w:ascii="Tahoma" w:eastAsia="Tahoma" w:hAnsi="Tahoma" w:cs="Tahoma"/>
@@ -5346,7 +5346,7 @@
     <w:p>
       <w:pPr>
         <w:keepNext/>
-        <w:spacing w:after="120" w:line="240" w:lineRule="atLeast"/>
+        <w:spacing w:after="102" w:line="204" w:lineRule="auto"/>
         <w:rPr>
           <w:rFonts w:ascii="Tahoma" w:eastAsia="Tahoma" w:hAnsi="Tahoma" w:cs="Tahoma"/>
           <w:sz w:val="20"/>
@@ -5357,7 +5357,7 @@
     <w:p>
       <w:pPr>
         <w:keepNext/>
-        <w:spacing w:after="120" w:line="240" w:lineRule="atLeast"/>
+        <w:spacing w:after="102" w:line="204" w:lineRule="auto"/>
         <w:rPr>
           <w:rFonts w:ascii="Tahoma" w:eastAsia="Tahoma" w:hAnsi="Tahoma" w:cs="Tahoma"/>
           <w:sz w:val="20"/>
@@ -5376,7 +5376,7 @@
     <w:p>
       <w:pPr>
         <w:keepNext/>
-        <w:spacing w:after="120" w:line="240" w:lineRule="atLeast"/>
+        <w:spacing w:after="102" w:line="204" w:lineRule="auto"/>
         <w:rPr>
           <w:rFonts w:ascii="Tahoma" w:eastAsia="Tahoma" w:hAnsi="Tahoma" w:cs="Tahoma"/>
           <w:sz w:val="20"/>
@@ -5415,7 +5415,7 @@
           <w:p>
             <w:pPr>
               <w:keepNext/>
-              <w:spacing w:line="240" w:lineRule="atLeast"/>
+              <w:spacing w:line="204" w:lineRule="auto"/>
               <w:rPr>
                 <w:rFonts w:ascii="Tahoma" w:eastAsia="Tahoma" w:hAnsi="Tahoma" w:cs="Tahoma"/>
                 <w:sz w:val="20"/>
@@ -5474,7 +5474,7 @@
           <w:p>
             <w:pPr>
               <w:keepNext/>
-              <w:spacing w:line="240" w:lineRule="atLeast"/>
+              <w:spacing w:line="204" w:lineRule="auto"/>
               <w:rPr>
                 <w:rFonts w:ascii="Tahoma" w:eastAsia="Tahoma" w:hAnsi="Tahoma" w:cs="Tahoma"/>
                 <w:sz w:val="20"/>
@@ -5489,7 +5489,7 @@
           <w:p>
             <w:pPr>
               <w:keepNext/>
-              <w:spacing w:line="240" w:lineRule="atLeast"/>
+              <w:spacing w:line="204" w:lineRule="auto"/>
               <w:rPr>
                 <w:rFonts w:ascii="Tahoma" w:eastAsia="Tahoma" w:hAnsi="Tahoma" w:cs="Tahoma"/>
                 <w:sz w:val="20"/>
@@ -5566,7 +5566,7 @@
           <w:p>
             <w:pPr>
               <w:keepNext/>
-              <w:spacing w:line="240" w:lineRule="atLeast"/>
+              <w:spacing w:line="204" w:lineRule="auto"/>
               <w:rPr>
                 <w:rFonts w:ascii="Tahoma" w:eastAsia="Tahoma" w:hAnsi="Tahoma" w:cs="Tahoma"/>
                 <w:sz w:val="20"/>
@@ -5588,7 +5588,7 @@
           <w:p>
             <w:pPr>
               <w:keepNext/>
-              <w:spacing w:line="240" w:lineRule="atLeast"/>
+              <w:spacing w:line="204" w:lineRule="auto"/>
               <w:rPr>
                 <w:rFonts w:ascii="Tahoma" w:eastAsia="Tahoma" w:hAnsi="Tahoma" w:cs="Tahoma"/>
                 <w:sz w:val="20"/>
@@ -5603,7 +5603,7 @@
           <w:p>
             <w:pPr>
               <w:keepNext/>
-              <w:spacing w:line="240" w:lineRule="atLeast"/>
+              <w:spacing w:line="204" w:lineRule="auto"/>
               <w:rPr>
                 <w:rFonts w:ascii="Tahoma" w:eastAsia="Tahoma" w:hAnsi="Tahoma" w:cs="Tahoma"/>
                 <w:sz w:val="20"/>
@@ -5633,7 +5633,7 @@
           <w:p>
             <w:pPr>
               <w:keepNext/>
-              <w:spacing w:line="240" w:lineRule="atLeast"/>
+              <w:spacing w:line="204" w:lineRule="auto"/>
               <w:rPr>
                 <w:rFonts w:ascii="Tahoma" w:eastAsia="Tahoma" w:hAnsi="Tahoma" w:cs="Tahoma"/>
                 <w:sz w:val="20"/>
@@ -5648,7 +5648,7 @@
           <w:p>
             <w:pPr>
               <w:keepNext/>
-              <w:spacing w:line="240" w:lineRule="atLeast"/>
+              <w:spacing w:line="204" w:lineRule="auto"/>
               <w:rPr>
                 <w:rFonts w:ascii="Tahoma" w:eastAsia="Tahoma" w:hAnsi="Tahoma" w:cs="Tahoma"/>
                 <w:sz w:val="20"/>
@@ -5666,7 +5666,7 @@
           <w:p>
             <w:pPr>
               <w:keepNext/>
-              <w:spacing w:line="240" w:lineRule="atLeast"/>
+              <w:spacing w:line="204" w:lineRule="auto"/>
               <w:rPr>
                 <w:rFonts w:ascii="Tahoma" w:eastAsia="Tahoma" w:hAnsi="Tahoma" w:cs="Tahoma"/>
                 <w:sz w:val="20"/>
@@ -5689,7 +5689,7 @@
           <w:p>
             <w:pPr>
               <w:keepNext/>
-              <w:spacing w:line="240" w:lineRule="atLeast"/>
+              <w:spacing w:line="204" w:lineRule="auto"/>
               <w:rPr>
                 <w:rFonts w:ascii="Tahoma" w:eastAsia="Tahoma" w:hAnsi="Tahoma" w:cs="Tahoma"/>
                 <w:b/>
@@ -5719,7 +5719,7 @@
           <w:p>
             <w:pPr>
               <w:keepNext/>
-              <w:spacing w:line="240" w:lineRule="atLeast"/>
+              <w:spacing w:line="204" w:lineRule="auto"/>
               <w:rPr>
                 <w:rFonts w:ascii="Tahoma" w:eastAsia="Tahoma" w:hAnsi="Tahoma" w:cs="Tahoma"/>
                 <w:sz w:val="20"/>
@@ -5736,7 +5736,7 @@
           <w:p>
             <w:pPr>
               <w:keepNext/>
-              <w:spacing w:line="240" w:lineRule="atLeast"/>
+              <w:spacing w:line="204" w:lineRule="auto"/>
               <w:rPr>
                 <w:rFonts w:ascii="Tahoma" w:eastAsia="Tahoma" w:hAnsi="Tahoma" w:cs="Tahoma"/>
                 <w:sz w:val="20"/>
@@ -5761,7 +5761,7 @@
           <w:p>
             <w:pPr>
               <w:keepNext/>
-              <w:spacing w:line="240" w:lineRule="atLeast"/>
+              <w:spacing w:line="204" w:lineRule="auto"/>
               <w:rPr>
                 <w:rFonts w:ascii="Tahoma" w:eastAsia="Tahoma" w:hAnsi="Tahoma" w:cs="Tahoma"/>
                 <w:sz w:val="20"/>
@@ -5782,7 +5782,7 @@
           <w:p>
             <w:pPr>
               <w:keepNext/>
-              <w:spacing w:line="240" w:lineRule="atLeast"/>
+              <w:spacing w:line="204" w:lineRule="auto"/>
               <w:rPr>
                 <w:rFonts w:ascii="Tahoma" w:eastAsia="Tahoma" w:hAnsi="Tahoma" w:cs="Tahoma"/>
                 <w:sz w:val="20"/>
@@ -5809,7 +5809,7 @@
     </w:tbl>
     <w:p>
       <w:pPr>
-        <w:spacing w:after="120" w:line="240" w:lineRule="atLeast"/>
+        <w:spacing w:after="102" w:line="204" w:lineRule="auto"/>
         <w:jc w:val="center"/>
         <w:rPr>
           <w:rFonts w:ascii="Tahoma" w:eastAsia="Tahoma" w:hAnsi="Tahoma" w:cs="Tahoma"/>
@@ -5843,7 +5843,7 @@
     </w:p>
     <w:p>
       <w:pPr>
-        <w:spacing w:after="120" w:line="240" w:lineRule="atLeast"/>
+        <w:spacing w:after="102" w:line="204" w:lineRule="auto"/>
         <w:jc w:val="center"/>
         <w:rPr>
           <w:rFonts w:ascii="Tahoma" w:eastAsia="Tahoma" w:hAnsi="Tahoma" w:cs="Tahoma"/>
@@ -5877,7 +5877,7 @@
     </w:p>
     <w:p>
       <w:pPr>
-        <w:spacing w:after="120" w:line="240" w:lineRule="atLeast"/>
+        <w:spacing w:after="102" w:line="204" w:lineRule="auto"/>
         <w:rPr>
           <w:rFonts w:ascii="Tahoma" w:eastAsia="Tahoma" w:hAnsi="Tahoma" w:cs="Tahoma"/>
           <w:sz w:val="20"/>
@@ -5931,7 +5931,7 @@
           </w:tcPr>
           <w:p>
             <w:pPr>
-              <w:spacing w:line="240" w:lineRule="atLeast"/>
+              <w:spacing w:line="204" w:lineRule="auto"/>
               <w:rPr>
                 <w:rFonts w:ascii="Tahoma" w:eastAsia="Tahoma" w:hAnsi="Tahoma" w:cs="Tahoma"/>
                 <w:sz w:val="20"/>
@@ -6032,7 +6032,7 @@
           </w:tcPr>
           <w:p>
             <w:pPr>
-              <w:spacing w:line="240" w:lineRule="atLeast"/>
+              <w:spacing w:line="204" w:lineRule="auto"/>
               <w:rPr>
                 <w:rFonts w:ascii="Tahoma" w:eastAsia="Tahoma" w:hAnsi="Tahoma" w:cs="Tahoma"/>
                 <w:sz w:val="20"/>
@@ -6081,7 +6081,7 @@
           </w:tcPr>
           <w:p>
             <w:pPr>
-              <w:spacing w:line="240" w:lineRule="atLeast"/>
+              <w:spacing w:line="204" w:lineRule="auto"/>
               <w:rPr>
                 <w:rFonts w:ascii="Tahoma" w:eastAsia="Tahoma" w:hAnsi="Tahoma" w:cs="Tahoma"/>
                 <w:sz w:val="20"/>
@@ -6136,7 +6136,7 @@
           </w:tcPr>
           <w:p>
             <w:pPr>
-              <w:spacing w:line="240" w:lineRule="atLeast"/>
+              <w:spacing w:line="204" w:lineRule="auto"/>
               <w:rPr>
                 <w:rFonts w:ascii="Tahoma" w:eastAsia="Tahoma" w:hAnsi="Tahoma" w:cs="Tahoma"/>
                 <w:sz w:val="20"/>
@@ -6180,7 +6180,7 @@
     </w:tbl>
     <w:p>
       <w:pPr>
-        <w:spacing w:after="120" w:line="240" w:lineRule="atLeast"/>
+        <w:spacing w:after="102" w:line="204" w:lineRule="auto"/>
         <w:rPr>
           <w:rFonts w:ascii="Tahoma" w:eastAsia="Tahoma" w:hAnsi="Tahoma" w:cs="Tahoma"/>
           <w:sz w:val="20"/>
@@ -6224,7 +6224,7 @@
     </w:p>
     <w:p>
       <w:pPr>
-        <w:spacing w:after="120" w:line="240" w:lineRule="atLeast"/>
+        <w:spacing w:after="102" w:line="204" w:lineRule="auto"/>
         <w:rPr>
           <w:rFonts w:ascii="Tahoma" w:eastAsia="Tahoma" w:hAnsi="Tahoma" w:cs="Tahoma"/>
           <w:b/>
@@ -6246,7 +6246,7 @@
     </w:p>
     <w:p>
       <w:pPr>
-        <w:spacing w:after="120" w:line="240" w:lineRule="atLeast"/>
+        <w:spacing w:after="102" w:line="204" w:lineRule="auto"/>
         <w:rPr>
           <w:rFonts w:ascii="Tahoma" w:eastAsia="Tahoma" w:hAnsi="Tahoma" w:cs="Tahoma"/>
           <w:b/>
@@ -6305,7 +6305,7 @@
           </w:tcPr>
           <w:p>
             <w:pPr>
-              <w:spacing w:line="240" w:lineRule="atLeast"/>
+              <w:spacing w:line="204" w:lineRule="auto"/>
               <w:rPr>
                 <w:rFonts w:ascii="Tahoma" w:eastAsia="Tahoma" w:hAnsi="Tahoma" w:cs="Tahoma"/>
                 <w:sz w:val="20"/>
@@ -6326,7 +6326,7 @@
           </w:tcPr>
           <w:p>
             <w:pPr>
-              <w:spacing w:line="240" w:lineRule="atLeast"/>
+              <w:spacing w:line="204" w:lineRule="auto"/>
               <w:rPr>
                 <w:rFonts w:ascii="Tahoma" w:eastAsia="Tahoma" w:hAnsi="Tahoma" w:cs="Tahoma"/>
                 <w:sz w:val="20"/>
@@ -6386,7 +6386,7 @@
           </w:tcPr>
           <w:p>
             <w:pPr>
-              <w:spacing w:line="240" w:lineRule="atLeast"/>
+              <w:spacing w:line="204" w:lineRule="auto"/>
               <w:rPr>
                 <w:rFonts w:ascii="Tahoma" w:eastAsia="Tahoma" w:hAnsi="Tahoma" w:cs="Tahoma"/>
                 <w:sz w:val="20"/>
@@ -6407,7 +6407,7 @@
           </w:tcPr>
           <w:p>
             <w:pPr>
-              <w:spacing w:line="240" w:lineRule="atLeast"/>
+              <w:spacing w:line="204" w:lineRule="auto"/>
               <w:rPr>
                 <w:rFonts w:ascii="Tahoma" w:eastAsia="Tahoma" w:hAnsi="Tahoma" w:cs="Tahoma"/>
                 <w:sz w:val="20"/>
@@ -6458,7 +6458,7 @@
           </w:tcPr>
           <w:p>
             <w:pPr>
-              <w:spacing w:line="240" w:lineRule="atLeast"/>
+              <w:spacing w:line="204" w:lineRule="auto"/>
               <w:rPr>
                 <w:rFonts w:ascii="Tahoma" w:eastAsia="Tahoma" w:hAnsi="Tahoma" w:cs="Tahoma"/>
                 <w:sz w:val="20"/>
@@ -6479,7 +6479,7 @@
           </w:tcPr>
           <w:p>
             <w:pPr>
-              <w:spacing w:line="240" w:lineRule="atLeast"/>
+              <w:spacing w:line="204" w:lineRule="auto"/>
               <w:rPr>
                 <w:rFonts w:ascii="Tahoma" w:eastAsia="Tahoma" w:hAnsi="Tahoma" w:cs="Tahoma"/>
                 <w:sz w:val="20"/>
@@ -6502,7 +6502,7 @@
           </w:tcPr>
           <w:p>
             <w:pPr>
-              <w:spacing w:line="240" w:lineRule="atLeast"/>
+              <w:spacing w:line="204" w:lineRule="auto"/>
               <w:rPr>
                 <w:rFonts w:ascii="Tahoma" w:eastAsia="Tahoma" w:hAnsi="Tahoma" w:cs="Tahoma"/>
                 <w:sz w:val="20"/>
@@ -6523,7 +6523,7 @@
           </w:tcPr>
           <w:p>
             <w:pPr>
-              <w:spacing w:line="240" w:lineRule="atLeast"/>
+              <w:spacing w:line="204" w:lineRule="auto"/>
               <w:rPr>
                 <w:rFonts w:ascii="Tahoma" w:eastAsia="Tahoma" w:hAnsi="Tahoma" w:cs="Tahoma"/>
                 <w:sz w:val="20"/>
@@ -6553,7 +6553,7 @@
           </w:tcPr>
           <w:p>
             <w:pPr>
-              <w:spacing w:line="240" w:lineRule="atLeast"/>
+              <w:spacing w:line="204" w:lineRule="auto"/>
               <w:rPr>
                 <w:rFonts w:ascii="Tahoma" w:eastAsia="Tahoma" w:hAnsi="Tahoma" w:cs="Tahoma"/>
                 <w:sz w:val="20"/>
@@ -6574,7 +6574,7 @@
           </w:tcPr>
           <w:p>
             <w:pPr>
-              <w:spacing w:line="240" w:lineRule="atLeast"/>
+              <w:spacing w:line="204" w:lineRule="auto"/>
               <w:rPr>
                 <w:rFonts w:ascii="Tahoma" w:eastAsia="Tahoma" w:hAnsi="Tahoma" w:cs="Tahoma"/>
                 <w:sz w:val="20"/>
@@ -6604,7 +6604,7 @@
           </w:tcPr>
           <w:p>
             <w:pPr>
-              <w:spacing w:line="240" w:lineRule="atLeast"/>
+              <w:spacing w:line="204" w:lineRule="auto"/>
               <w:rPr>
                 <w:rFonts w:ascii="Tahoma" w:eastAsia="Tahoma" w:hAnsi="Tahoma" w:cs="Tahoma"/>
                 <w:sz w:val="20"/>
@@ -6625,7 +6625,7 @@
           </w:tcPr>
           <w:p>
             <w:pPr>
-              <w:spacing w:line="240" w:lineRule="atLeast"/>
+              <w:spacing w:line="204" w:lineRule="auto"/>
               <w:rPr>
                 <w:rFonts w:ascii="Tahoma" w:eastAsia="Tahoma" w:hAnsi="Tahoma" w:cs="Tahoma"/>
                 <w:sz w:val="20"/>
@@ -6648,7 +6648,7 @@
           </w:tcPr>
           <w:p>
             <w:pPr>
-              <w:spacing w:line="240" w:lineRule="atLeast"/>
+              <w:spacing w:line="204" w:lineRule="auto"/>
               <w:rPr>
                 <w:rFonts w:ascii="Tahoma" w:eastAsia="Tahoma" w:hAnsi="Tahoma" w:cs="Tahoma"/>
                 <w:sz w:val="20"/>
@@ -6669,7 +6669,7 @@
           </w:tcPr>
           <w:p>
             <w:pPr>
-              <w:spacing w:line="240" w:lineRule="atLeast"/>
+              <w:spacing w:line="204" w:lineRule="auto"/>
               <w:rPr>
                 <w:rFonts w:ascii="Tahoma" w:eastAsia="Tahoma" w:hAnsi="Tahoma" w:cs="Tahoma"/>
                 <w:sz w:val="20"/>
@@ -6702,7 +6702,7 @@
     </w:tbl>
     <w:p>
       <w:pPr>
-        <w:spacing w:after="120" w:line="240" w:lineRule="atLeast"/>
+        <w:spacing w:after="102" w:line="204" w:lineRule="auto"/>
         <w:rPr>
           <w:rFonts w:ascii="Tahoma" w:eastAsia="Tahoma" w:hAnsi="Tahoma" w:cs="Tahoma"/>
           <w:sz w:val="20"/>
@@ -6738,7 +6738,7 @@
     </w:p>
     <w:p>
       <w:pPr>
-        <w:spacing w:after="120" w:line="240" w:lineRule="atLeast"/>
+        <w:spacing w:after="102" w:line="204" w:lineRule="auto"/>
         <w:rPr>
           <w:rFonts w:ascii="Tahoma" w:eastAsia="Tahoma" w:hAnsi="Tahoma" w:cs="Tahoma"/>
           <w:sz w:val="20"/>
@@ -6832,7 +6832,7 @@
     </w:p>
     <w:p>
       <w:pPr>
-        <w:spacing w:after="120" w:line="240" w:lineRule="atLeast"/>
+        <w:spacing w:after="102" w:line="204" w:lineRule="auto"/>
         <w:rPr>
           <w:rFonts w:ascii="Tahoma" w:eastAsia="Tahoma" w:hAnsi="Tahoma" w:cs="Tahoma"/>
           <w:sz w:val="20"/>
@@ -6876,7 +6876,7 @@
     </w:p>
     <w:p>
       <w:pPr>
-        <w:spacing w:after="120" w:line="240" w:lineRule="atLeast"/>
+        <w:spacing w:after="102" w:line="204" w:lineRule="auto"/>
         <w:rPr>
           <w:rFonts w:ascii="Tahoma" w:eastAsia="Tahoma" w:hAnsi="Tahoma" w:cs="Tahoma"/>
           <w:sz w:val="20"/>
@@ -6886,7 +6886,7 @@
     </w:p>
     <w:p>
       <w:pPr>
-        <w:spacing w:line="240" w:lineRule="atLeast"/>
+        <w:spacing w:line="204" w:lineRule="auto"/>
         <w:rPr>
           <w:rFonts w:ascii="Tahoma" w:eastAsia="Tahoma" w:hAnsi="Tahoma" w:cs="Tahoma"/>
           <w:sz w:val="20"/>
@@ -6973,7 +6973,7 @@
     </w:p>
     <w:p>
       <w:pPr>
-        <w:spacing w:after="120" w:line="240" w:lineRule="atLeast"/>
+        <w:spacing w:after="102" w:line="204" w:lineRule="auto"/>
         <w:rPr>
           <w:rFonts w:ascii="Tahoma" w:eastAsia="Tahoma" w:hAnsi="Tahoma" w:cs="Tahoma"/>
           <w:sz w:val="20"/>
@@ -6983,7 +6983,7 @@
     </w:p>
     <w:p>
       <w:pPr>
-        <w:spacing w:after="120" w:line="240" w:lineRule="atLeast"/>
+        <w:spacing w:after="102" w:line="204" w:lineRule="auto"/>
         <w:rPr>
           <w:rFonts w:ascii="Tahoma" w:eastAsia="Tahoma" w:hAnsi="Tahoma" w:cs="Tahoma"/>
           <w:b/>
@@ -7005,7 +7005,7 @@
     </w:p>
     <w:p>
       <w:pPr>
-        <w:spacing w:after="120" w:line="240" w:lineRule="atLeast"/>
+        <w:spacing w:after="102" w:line="204" w:lineRule="auto"/>
         <w:rPr>
           <w:rFonts w:ascii="Tahoma" w:eastAsia="Tahoma" w:hAnsi="Tahoma" w:cs="Tahoma"/>
           <w:sz w:val="20"/>
@@ -7043,7 +7043,7 @@
           </w:tcPr>
           <w:p>
             <w:pPr>
-              <w:spacing w:line="240" w:lineRule="atLeast"/>
+              <w:spacing w:line="204" w:lineRule="auto"/>
               <w:rPr>
                 <w:rFonts w:ascii="Tahoma" w:eastAsia="Tahoma" w:hAnsi="Tahoma" w:cs="Tahoma"/>
                 <w:sz w:val="20"/>
@@ -7114,7 +7114,7 @@
           </w:tcPr>
           <w:p>
             <w:pPr>
-              <w:spacing w:line="240" w:lineRule="atLeast"/>
+              <w:spacing w:line="204" w:lineRule="auto"/>
               <w:rPr>
                 <w:rFonts w:ascii="Tahoma" w:eastAsia="Tahoma" w:hAnsi="Tahoma" w:cs="Tahoma"/>
                 <w:sz w:val="20"/>
@@ -7128,7 +7128,7 @@
           </w:tcPr>
           <w:p>
             <w:pPr>
-              <w:spacing w:line="240" w:lineRule="atLeast"/>
+              <w:spacing w:line="204" w:lineRule="auto"/>
               <w:rPr>
                 <w:rFonts w:ascii="Tahoma" w:eastAsia="Tahoma" w:hAnsi="Tahoma" w:cs="Tahoma"/>
                 <w:sz w:val="20"/>
@@ -7198,7 +7198,7 @@
           </w:tcPr>
           <w:p>
             <w:pPr>
-              <w:spacing w:line="240" w:lineRule="atLeast"/>
+              <w:spacing w:line="204" w:lineRule="auto"/>
               <w:rPr>
                 <w:rFonts w:ascii="Tahoma" w:eastAsia="Tahoma" w:hAnsi="Tahoma" w:cs="Tahoma"/>
                 <w:sz w:val="20"/>
@@ -7219,7 +7219,7 @@
           </w:tcPr>
           <w:p>
             <w:pPr>
-              <w:spacing w:line="240" w:lineRule="atLeast"/>
+              <w:spacing w:line="204" w:lineRule="auto"/>
               <w:rPr>
                 <w:rFonts w:ascii="Tahoma" w:eastAsia="Tahoma" w:hAnsi="Tahoma" w:cs="Tahoma"/>
                 <w:sz w:val="20"/>
@@ -7233,7 +7233,7 @@
           </w:tcPr>
           <w:p>
             <w:pPr>
-              <w:spacing w:line="240" w:lineRule="atLeast"/>
+              <w:spacing w:line="204" w:lineRule="auto"/>
               <w:rPr>
                 <w:rFonts w:ascii="Tahoma" w:eastAsia="Tahoma" w:hAnsi="Tahoma" w:cs="Tahoma"/>
                 <w:sz w:val="20"/>
@@ -7256,7 +7256,7 @@
           </w:tcPr>
           <w:p>
             <w:pPr>
-              <w:spacing w:line="240" w:lineRule="atLeast"/>
+              <w:spacing w:line="204" w:lineRule="auto"/>
               <w:rPr>
                 <w:rFonts w:ascii="Tahoma" w:eastAsia="Tahoma" w:hAnsi="Tahoma" w:cs="Tahoma"/>
                 <w:sz w:val="20"/>
@@ -7270,7 +7270,7 @@
           </w:tcPr>
           <w:p>
             <w:pPr>
-              <w:spacing w:line="240" w:lineRule="atLeast"/>
+              <w:spacing w:line="204" w:lineRule="auto"/>
               <w:rPr>
                 <w:rFonts w:ascii="Tahoma" w:eastAsia="Tahoma" w:hAnsi="Tahoma" w:cs="Tahoma"/>
                 <w:sz w:val="20"/>
@@ -7284,7 +7284,7 @@
           </w:tcPr>
           <w:p>
             <w:pPr>
-              <w:spacing w:line="240" w:lineRule="atLeast"/>
+              <w:spacing w:line="204" w:lineRule="auto"/>
               <w:rPr>
                 <w:rFonts w:ascii="Tahoma" w:eastAsia="Tahoma" w:hAnsi="Tahoma" w:cs="Tahoma"/>
                 <w:sz w:val="20"/>
@@ -7303,7 +7303,7 @@
           </w:tcPr>
           <w:p>
             <w:pPr>
-              <w:spacing w:line="240" w:lineRule="atLeast"/>
+              <w:spacing w:line="204" w:lineRule="auto"/>
               <w:jc w:val="center"/>
               <w:rPr>
                 <w:rFonts w:ascii="Tahoma" w:eastAsia="Tahoma" w:hAnsi="Tahoma" w:cs="Tahoma"/>
@@ -7318,7 +7318,7 @@
           </w:tcPr>
           <w:p>
             <w:pPr>
-              <w:spacing w:line="240" w:lineRule="atLeast"/>
+              <w:spacing w:line="204" w:lineRule="auto"/>
               <w:rPr>
                 <w:rFonts w:ascii="Tahoma" w:eastAsia="Tahoma" w:hAnsi="Tahoma" w:cs="Tahoma"/>
                 <w:sz w:val="20"/>
@@ -7332,7 +7332,7 @@
           </w:tcPr>
           <w:p>
             <w:pPr>
-              <w:spacing w:line="240" w:lineRule="atLeast"/>
+              <w:spacing w:line="204" w:lineRule="auto"/>
               <w:rPr>
                 <w:rFonts w:ascii="Tahoma" w:eastAsia="Tahoma" w:hAnsi="Tahoma" w:cs="Tahoma"/>
                 <w:sz w:val="20"/>
@@ -7354,7 +7354,7 @@
           </w:tcPr>
           <w:p>
             <w:pPr>
-              <w:spacing w:line="240" w:lineRule="atLeast"/>
+              <w:spacing w:line="204" w:lineRule="auto"/>
               <w:rPr>
                 <w:rFonts w:ascii="Tahoma" w:eastAsia="Tahoma" w:hAnsi="Tahoma" w:cs="Tahoma"/>
                 <w:sz w:val="20"/>
@@ -7368,7 +7368,7 @@
           </w:tcPr>
           <w:p>
             <w:pPr>
-              <w:spacing w:line="240" w:lineRule="atLeast"/>
+              <w:spacing w:line="204" w:lineRule="auto"/>
               <w:rPr>
                 <w:rFonts w:ascii="Tahoma" w:eastAsia="Tahoma" w:hAnsi="Tahoma" w:cs="Tahoma"/>
                 <w:sz w:val="20"/>
@@ -7385,7 +7385,7 @@
           </w:tcPr>
           <w:p>
             <w:pPr>
-              <w:spacing w:line="240" w:lineRule="atLeast"/>
+              <w:spacing w:line="204" w:lineRule="auto"/>
               <w:rPr>
                 <w:rFonts w:ascii="Tahoma" w:eastAsia="Tahoma" w:hAnsi="Tahoma" w:cs="Tahoma"/>
                 <w:sz w:val="20"/>
@@ -7407,7 +7407,7 @@
           </w:tcPr>
           <w:p>
             <w:pPr>
-              <w:spacing w:line="240" w:lineRule="atLeast"/>
+              <w:spacing w:line="204" w:lineRule="auto"/>
               <w:rPr>
                 <w:rFonts w:ascii="Tahoma" w:eastAsia="Tahoma" w:hAnsi="Tahoma" w:cs="Tahoma"/>
                 <w:b/>
@@ -7436,7 +7436,7 @@
           </w:p>
           <w:p>
             <w:pPr>
-              <w:spacing w:line="240" w:lineRule="atLeast"/>
+              <w:spacing w:line="204" w:lineRule="auto"/>
               <w:rPr>
                 <w:rFonts w:ascii="Tahoma" w:eastAsia="Tahoma" w:hAnsi="Tahoma" w:cs="Tahoma"/>
                 <w:sz w:val="20"/>
@@ -7467,7 +7467,7 @@
           </w:tcPr>
           <w:p>
             <w:pPr>
-              <w:spacing w:line="240" w:lineRule="atLeast"/>
+              <w:spacing w:line="204" w:lineRule="auto"/>
               <w:rPr>
                 <w:rFonts w:ascii="Tahoma" w:eastAsia="Tahoma" w:hAnsi="Tahoma" w:cs="Tahoma"/>
                 <w:sz w:val="20"/>
@@ -7487,7 +7487,7 @@
           </w:tcPr>
           <w:p>
             <w:pPr>
-              <w:spacing w:line="240" w:lineRule="atLeast"/>
+              <w:spacing w:line="204" w:lineRule="auto"/>
               <w:rPr>
                 <w:rFonts w:ascii="Tahoma" w:eastAsia="Tahoma" w:hAnsi="Tahoma" w:cs="Tahoma"/>
                 <w:sz w:val="20"/>
@@ -8461,7 +8461,7 @@
     </w:rPrDefault>
     <w:pPrDefault>
       <w:pPr>
-        <w:spacing w:after="160" w:line="259" w:lineRule="auto"/>
+        <w:spacing w:after="136" w:line="220" w:lineRule="auto"/>
       </w:pPr>
     </w:pPrDefault>
   </w:docDefaults>
@@ -8859,7 +8859,7 @@
     <w:pPr>
       <w:keepNext/>
       <w:keepLines/>
-      <w:spacing w:before="360" w:after="120" w:line="240" w:lineRule="atLeast"/>
+      <w:spacing w:before="306" w:after="102" w:line="204" w:lineRule="auto"/>
       <w:outlineLvl w:val="1"/>
     </w:pPr>
     <w:rPr>
@@ -8911,7 +8911,7 @@
         <w:tab w:val="center" w:pos="4536"/>
         <w:tab w:val="right" w:pos="9072"/>
       </w:tabs>
-      <w:spacing w:after="0" w:line="192" w:lineRule="atLeast"/>
+      <w:spacing w:after="0" w:line="163" w:lineRule="auto"/>
     </w:pPr>
     <w:rPr>
       <w:rFonts w:eastAsiaTheme="minorHAnsi"/>
@@ -8947,7 +8947,7 @@
         <w:tab w:val="center" w:pos="4536"/>
         <w:tab w:val="right" w:pos="9072"/>
       </w:tabs>
-      <w:spacing w:after="0" w:line="240" w:lineRule="auto"/>
+      <w:spacing w:after="0" w:line="204" w:lineRule="auto"/>
     </w:pPr>
     <w:rPr>
       <w:rFonts w:eastAsiaTheme="minorHAnsi"/>
@@ -8983,7 +8983,7 @@
       <w:numPr>
         <w:numId w:val="1"/>
       </w:numPr>
-      <w:spacing w:after="120" w:line="240" w:lineRule="atLeast"/>
+      <w:spacing w:after="102" w:line="204" w:lineRule="auto"/>
     </w:pPr>
     <w:rPr>
       <w:rFonts w:eastAsiaTheme="minorHAnsi"/>
@@ -8999,7 +8999,7 @@
     <w:uiPriority w:val="39"/>
     <w:rsid w:val="00BE5539"/>
     <w:pPr>
-      <w:spacing w:after="0" w:line="240" w:lineRule="auto"/>
+      <w:spacing w:after="0" w:line="204" w:lineRule="auto"/>
     </w:pPr>
     <w:rPr>
       <w:rFonts w:eastAsiaTheme="minorHAnsi"/>
@@ -9030,7 +9030,7 @@
       <w:numPr>
         <w:numId w:val="2"/>
       </w:numPr>
-      <w:spacing w:before="360" w:after="120" w:line="240" w:lineRule="atLeast"/>
+      <w:spacing w:before="306" w:after="102" w:line="204" w:lineRule="auto"/>
       <w:jc w:val="center"/>
     </w:pPr>
     <w:rPr>
@@ -9053,7 +9053,7 @@
         <w:ilvl w:val="1"/>
         <w:numId w:val="2"/>
       </w:numPr>
-      <w:spacing w:after="120" w:line="240" w:lineRule="atLeast"/>
+      <w:spacing w:after="102" w:line="204" w:lineRule="auto"/>
     </w:pPr>
     <w:rPr>
       <w:rFonts w:ascii="Tahoma" w:eastAsiaTheme="minorHAnsi" w:hAnsi="Tahoma"/>
@@ -9074,7 +9074,7 @@
         <w:ilvl w:val="2"/>
         <w:numId w:val="2"/>
       </w:numPr>
-      <w:spacing w:after="120" w:line="240" w:lineRule="atLeast"/>
+      <w:spacing w:after="102" w:line="204" w:lineRule="auto"/>
     </w:pPr>
     <w:rPr>
       <w:rFonts w:ascii="Tahoma" w:eastAsiaTheme="minorHAnsi" w:hAnsi="Tahoma"/>
@@ -9095,7 +9095,7 @@
         <w:ilvl w:val="3"/>
         <w:numId w:val="2"/>
       </w:numPr>
-      <w:spacing w:after="120" w:line="240" w:lineRule="atLeast"/>
+      <w:spacing w:after="102" w:line="204" w:lineRule="auto"/>
     </w:pPr>
     <w:rPr>
       <w:rFonts w:eastAsiaTheme="minorHAnsi"/>
@@ -9115,7 +9115,7 @@
       <w:numPr>
         <w:numId w:val="3"/>
       </w:numPr>
-      <w:spacing w:after="120" w:line="240" w:lineRule="atLeast"/>
+      <w:spacing w:after="102" w:line="204" w:lineRule="auto"/>
     </w:pPr>
     <w:rPr>
       <w:rFonts w:eastAsiaTheme="minorHAnsi"/>
@@ -9131,7 +9131,7 @@
     <w:qFormat/>
     <w:rsid w:val="00BE5539"/>
     <w:pPr>
-      <w:spacing w:after="0" w:line="240" w:lineRule="atLeast"/>
+      <w:spacing w:after="0" w:line="204" w:lineRule="auto"/>
     </w:pPr>
     <w:rPr>
       <w:rFonts w:eastAsiaTheme="minorHAnsi"/>
@@ -9158,7 +9158,7 @@
     <w:semiHidden/>
     <w:rsid w:val="007E1B51"/>
     <w:pPr>
-      <w:spacing w:after="0" w:line="240" w:lineRule="auto"/>
+      <w:spacing w:after="0" w:line="204" w:lineRule="auto"/>
     </w:pPr>
   </w:style>
   <w:style w:type="character" w:styleId="Hypertextovodkaz">
@@ -9180,7 +9180,7 @@
     <w:unhideWhenUsed/>
     <w:rsid w:val="00B61DBF"/>
     <w:pPr>
-      <w:spacing w:before="100" w:beforeAutospacing="1" w:after="100" w:afterAutospacing="1" w:line="240" w:lineRule="auto"/>
+      <w:spacing w:before="85" w:beforeAutospacing="1" w:after="85" w:afterAutospacing="1" w:line="204" w:lineRule="auto"/>
     </w:pPr>
     <w:rPr>
       <w:rFonts w:ascii="Times New Roman" w:eastAsia="Times New Roman" w:hAnsi="Times New Roman" w:cs="Times New Roman"/>
@@ -9210,7 +9210,7 @@
     <w:unhideWhenUsed/>
     <w:rsid w:val="005126EB"/>
     <w:pPr>
-      <w:spacing w:line="240" w:lineRule="auto"/>
+      <w:spacing w:line="204" w:lineRule="auto"/>
     </w:pPr>
     <w:rPr>
       <w:sz w:val="20"/>
@@ -9294,7 +9294,7 @@
       <w:tabs>
         <w:tab w:val="clear" w:pos="1701"/>
       </w:tabs>
-      <w:spacing w:after="120" w:line="240" w:lineRule="atLeast"/>
+      <w:spacing w:after="102" w:line="204" w:lineRule="auto"/>
       <w:ind w:left="0" w:firstLine="0"/>
     </w:pPr>
     <w:rPr>

</xml_diff>